<commit_message>
Collect traffic ETL snapshot
</commit_message>
<xml_diff>
--- a/outputs/report/non_iid_etl_report.docx
+++ b/outputs/report/non_iid_etl_report.docx
@@ -302,7 +302,7 @@
           </w:tcPr>
           <w:p>
             <w:r>
-              <w:t>23.4444</w:t>
+              <w:t>22.8889</w:t>
             </w:r>
           </w:p>
         </w:tc>
@@ -312,7 +312,7 @@
           </w:tcPr>
           <w:p>
             <w:r>
-              <w:t>0.3111</w:t>
+              <w:t>0.3148</w:t>
             </w:r>
           </w:p>
         </w:tc>
@@ -404,7 +404,7 @@
           </w:tcPr>
           <w:p>
             <w:r>
-              <w:t>25.0</w:t>
+              <w:t>26.8889</w:t>
             </w:r>
           </w:p>
         </w:tc>
@@ -414,7 +414,7 @@
           </w:tcPr>
           <w:p>
             <w:r>
-              <w:t>0.332</w:t>
+              <w:t>0.2825</w:t>
             </w:r>
           </w:p>
         </w:tc>
@@ -506,7 +506,7 @@
           </w:tcPr>
           <w:p>
             <w:r>
-              <w:t>23.0</w:t>
+              <w:t>22.1111</w:t>
             </w:r>
           </w:p>
         </w:tc>
@@ -516,7 +516,7 @@
           </w:tcPr>
           <w:p>
             <w:r>
-              <w:t>0.2708</w:t>
+              <w:t>0.2878</w:t>
             </w:r>
           </w:p>
         </w:tc>
@@ -699,7 +699,7 @@
           </w:tcPr>
           <w:p>
             <w:r>
-              <w:t>23.4444</w:t>
+              <w:t>22.8889</w:t>
             </w:r>
           </w:p>
         </w:tc>
@@ -709,7 +709,7 @@
           </w:tcPr>
           <w:p>
             <w:r>
-              <w:t>2.9102</w:t>
+              <w:t>2.0787</w:t>
             </w:r>
           </w:p>
         </w:tc>
@@ -719,7 +719,7 @@
           </w:tcPr>
           <w:p>
             <w:r>
-              <w:t>18.0</w:t>
+              <w:t>19.0</w:t>
             </w:r>
           </w:p>
         </w:tc>
@@ -729,7 +729,7 @@
           </w:tcPr>
           <w:p>
             <w:r>
-              <w:t>25.0</w:t>
+              <w:t>24.0</w:t>
             </w:r>
           </w:p>
         </w:tc>
@@ -771,7 +771,7 @@
           </w:tcPr>
           <w:p>
             <w:r>
-              <w:t>25.0</w:t>
+              <w:t>26.8889</w:t>
             </w:r>
           </w:p>
         </w:tc>
@@ -781,7 +781,7 @@
           </w:tcPr>
           <w:p>
             <w:r>
-              <w:t>0.0</w:t>
+              <w:t>1.663</w:t>
             </w:r>
           </w:p>
         </w:tc>
@@ -791,7 +791,7 @@
           </w:tcPr>
           <w:p>
             <w:r>
-              <w:t>25.0</w:t>
+              <w:t>26.0</w:t>
             </w:r>
           </w:p>
         </w:tc>
@@ -801,7 +801,7 @@
           </w:tcPr>
           <w:p>
             <w:r>
-              <w:t>25.0</w:t>
+              <w:t>30.0</w:t>
             </w:r>
           </w:p>
         </w:tc>
@@ -811,7 +811,7 @@
           </w:tcPr>
           <w:p>
             <w:r>
-              <w:t>0.0</w:t>
+              <w:t>1.3363</w:t>
             </w:r>
           </w:p>
         </w:tc>
@@ -843,7 +843,7 @@
           </w:tcPr>
           <w:p>
             <w:r>
-              <w:t>23.0</w:t>
+              <w:t>22.1111</w:t>
             </w:r>
           </w:p>
         </w:tc>
@@ -853,7 +853,7 @@
           </w:tcPr>
           <w:p>
             <w:r>
-              <w:t>2.9814</w:t>
+              <w:t>2.6851</w:t>
             </w:r>
           </w:p>
         </w:tc>
@@ -873,7 +873,7 @@
           </w:tcPr>
           <w:p>
             <w:r>
-              <w:t>25.0</w:t>
+              <w:t>24.0</w:t>
             </w:r>
           </w:p>
         </w:tc>
@@ -883,7 +883,7 @@
           </w:tcPr>
           <w:p>
             <w:r>
-              <w:t>-2.0125</w:t>
+              <w:t>-1.9092</w:t>
             </w:r>
           </w:p>
         </w:tc>
@@ -981,7 +981,7 @@
           </w:tcPr>
           <w:p>
             <w:r>
-              <w:t>0.2222</w:t>
+              <w:t>1.0</w:t>
             </w:r>
           </w:p>
         </w:tc>
@@ -991,7 +991,7 @@
           </w:tcPr>
           <w:p>
             <w:r>
-              <w:t>0.3481</w:t>
+              <w:t>1.0</w:t>
             </w:r>
           </w:p>
         </w:tc>
@@ -1085,7 +1085,7 @@
           </w:tcPr>
           <w:p>
             <w:r>
-              <w:t>0.5556</w:t>
+              <w:t>1.0</w:t>
             </w:r>
           </w:p>
         </w:tc>
@@ -1095,7 +1095,7 @@
           </w:tcPr>
           <w:p>
             <w:r>
-              <w:t>0.5974</w:t>
+              <w:t>1.0</w:t>
             </w:r>
           </w:p>
         </w:tc>

</xml_diff>

<commit_message>
fix(vercel): exclude static JSON data files and asset bundles from SPA index.html rewrite rule
</commit_message>
<xml_diff>
--- a/outputs/report/non_iid_etl_report.docx
+++ b/outputs/report/non_iid_etl_report.docx
@@ -404,7 +404,7 @@
           </w:tcPr>
           <w:p>
             <w:r>
-              <w:t>33.0</w:t>
+              <w:t>28.7972</w:t>
             </w:r>
           </w:p>
         </w:tc>
@@ -414,7 +414,7 @@
           </w:tcPr>
           <w:p>
             <w:r>
-              <w:t>0.0</w:t>
+              <w:t>0.0252</w:t>
             </w:r>
           </w:p>
         </w:tc>
@@ -434,7 +434,7 @@
           </w:tcPr>
           <w:p>
             <w:r>
-              <w:t>thoang</w:t>
+              <w:t>trung_binh</w:t>
             </w:r>
           </w:p>
         </w:tc>
@@ -444,7 +444,7 @@
           </w:tcPr>
           <w:p>
             <w:r>
-              <w:t>1.0</w:t>
+              <w:t>0.996</w:t>
             </w:r>
           </w:p>
         </w:tc>
@@ -454,7 +454,7 @@
           </w:tcPr>
           <w:p>
             <w:r>
-              <w:t>3</w:t>
+              <w:t>9</w:t>
             </w:r>
           </w:p>
         </w:tc>
@@ -812,7 +812,7 @@
           </w:tcPr>
           <w:p>
             <w:r>
-              <w:t>33.7778</w:t>
+              <w:t>33.3333</w:t>
             </w:r>
           </w:p>
         </w:tc>
@@ -1118,7 +1118,7 @@
           </w:tcPr>
           <w:p>
             <w:r>
-              <w:t>37.3333</w:t>
+              <w:t>35.6667</w:t>
             </w:r>
           </w:p>
         </w:tc>
@@ -1128,7 +1128,7 @@
           </w:tcPr>
           <w:p>
             <w:r>
-              <w:t>0.0</w:t>
+              <w:t>0.0427</w:t>
             </w:r>
           </w:p>
         </w:tc>
@@ -1475,7 +1475,7 @@
           </w:tcPr>
           <w:p>
             <w:r>
-              <w:t>3</w:t>
+              <w:t>9</w:t>
             </w:r>
           </w:p>
         </w:tc>
@@ -1485,7 +1485,7 @@
           </w:tcPr>
           <w:p>
             <w:r>
-              <w:t>33.0</w:t>
+              <w:t>28.7778</w:t>
             </w:r>
           </w:p>
         </w:tc>
@@ -1495,7 +1495,7 @@
           </w:tcPr>
           <w:p>
             <w:r>
-              <w:t>0.0</w:t>
+              <w:t>5.0062</w:t>
             </w:r>
           </w:p>
         </w:tc>
@@ -1505,7 +1505,7 @@
           </w:tcPr>
           <w:p>
             <w:r>
-              <w:t>33.0</w:t>
+              <w:t>20.0</w:t>
             </w:r>
           </w:p>
         </w:tc>
@@ -1515,7 +1515,7 @@
           </w:tcPr>
           <w:p>
             <w:r>
-              <w:t>33.0</w:t>
+              <w:t>35.0</w:t>
             </w:r>
           </w:p>
         </w:tc>
@@ -1525,7 +1525,7 @@
           </w:tcPr>
           <w:p>
             <w:r>
-              <w:t>0.0</w:t>
+              <w:t>-0.267</w:t>
             </w:r>
           </w:p>
         </w:tc>
@@ -1773,7 +1773,7 @@
           </w:tcPr>
           <w:p>
             <w:r>
-              <w:t>33.7778</w:t>
+              <w:t>33.3333</w:t>
             </w:r>
           </w:p>
         </w:tc>
@@ -1783,7 +1783,7 @@
           </w:tcPr>
           <w:p>
             <w:r>
-              <w:t>3.7647</w:t>
+              <w:t>1.4907</w:t>
             </w:r>
           </w:p>
         </w:tc>
@@ -1793,7 +1793,7 @@
           </w:tcPr>
           <w:p>
             <w:r>
-              <w:t>30.0</w:t>
+              <w:t>32.0</w:t>
             </w:r>
           </w:p>
         </w:tc>
@@ -1803,7 +1803,7 @@
           </w:tcPr>
           <w:p>
             <w:r>
-              <w:t>43.0</w:t>
+              <w:t>35.0</w:t>
             </w:r>
           </w:p>
         </w:tc>
@@ -1813,7 +1813,7 @@
           </w:tcPr>
           <w:p>
             <w:r>
-              <w:t>1.4351</w:t>
+              <w:t>0.2236</w:t>
             </w:r>
           </w:p>
         </w:tc>
@@ -1989,7 +1989,7 @@
           </w:tcPr>
           <w:p>
             <w:r>
-              <w:t>37.3333</w:t>
+              <w:t>35.6667</w:t>
             </w:r>
           </w:p>
         </w:tc>
@@ -1999,7 +1999,7 @@
           </w:tcPr>
           <w:p>
             <w:r>
-              <w:t>1.4907</w:t>
+              <w:t>4.3461</w:t>
             </w:r>
           </w:p>
         </w:tc>
@@ -2009,7 +2009,7 @@
           </w:tcPr>
           <w:p>
             <w:r>
-              <w:t>36.0</w:t>
+              <w:t>24.0</w:t>
             </w:r>
           </w:p>
         </w:tc>
@@ -2029,7 +2029,7 @@
           </w:tcPr>
           <w:p>
             <w:r>
-              <w:t>0.2236</w:t>
+              <w:t>-1.9986</w:t>
             </w:r>
           </w:p>
         </w:tc>
@@ -2209,7 +2209,7 @@
           </w:tcPr>
           <w:p>
             <w:r>
-              <w:t>1.0</w:t>
+              <w:t>0.7588</w:t>
             </w:r>
           </w:p>
         </w:tc>
@@ -2407,7 +2407,7 @@
           </w:tcPr>
           <w:p>
             <w:r>
-              <w:t>0.3333</w:t>
+              <w:t>0.4444</w:t>
             </w:r>
           </w:p>
         </w:tc>
@@ -2417,7 +2417,7 @@
           </w:tcPr>
           <w:p>
             <w:r>
-              <w:t>0.5303</w:t>
+              <w:t>0.7103</w:t>
             </w:r>
           </w:p>
         </w:tc>
@@ -2563,7 +2563,7 @@
           </w:tcPr>
           <w:p>
             <w:r>
-              <w:t>1.0</w:t>
+              <w:t>0.8889</w:t>
             </w:r>
           </w:p>
         </w:tc>
@@ -2667,7 +2667,7 @@
           </w:tcPr>
           <w:p>
             <w:r>
-              <w:t>1.0</w:t>
+              <w:t>0.6667</w:t>
             </w:r>
           </w:p>
         </w:tc>
@@ -2677,7 +2677,7 @@
           </w:tcPr>
           <w:p>
             <w:r>
-              <w:t>1.0</w:t>
+              <w:t>0.6776</w:t>
             </w:r>
           </w:p>
         </w:tc>
@@ -2719,7 +2719,7 @@
           </w:tcPr>
           <w:p>
             <w:r>
-              <w:t>1.0</w:t>
+              <w:t>0.4444</w:t>
             </w:r>
           </w:p>
         </w:tc>
@@ -2729,7 +2729,7 @@
           </w:tcPr>
           <w:p>
             <w:r>
-              <w:t>1.0</w:t>
+              <w:t>0.833</w:t>
             </w:r>
           </w:p>
         </w:tc>
@@ -2771,7 +2771,7 @@
           </w:tcPr>
           <w:p>
             <w:r>
-              <w:t>1.0</w:t>
+              <w:t>0.5556</w:t>
             </w:r>
           </w:p>
         </w:tc>
@@ -2833,7 +2833,7 @@
           </w:tcPr>
           <w:p>
             <w:r>
-              <w:t>0.7629</w:t>
+              <w:t>0.6326</w:t>
             </w:r>
           </w:p>
         </w:tc>
@@ -2875,7 +2875,7 @@
           </w:tcPr>
           <w:p>
             <w:r>
-              <w:t>0.8889</w:t>
+              <w:t>0.3333</w:t>
             </w:r>
           </w:p>
         </w:tc>
@@ -2885,7 +2885,7 @@
           </w:tcPr>
           <w:p>
             <w:r>
-              <w:t>0.7629</w:t>
+              <w:t>0.8165</w:t>
             </w:r>
           </w:p>
         </w:tc>
@@ -2979,7 +2979,7 @@
           </w:tcPr>
           <w:p>
             <w:r>
-              <w:t>1.0</w:t>
+              <w:t>0.8889</w:t>
             </w:r>
           </w:p>
         </w:tc>
@@ -2989,7 +2989,7 @@
           </w:tcPr>
           <w:p>
             <w:r>
-              <w:t>1.0</w:t>
+              <w:t>0.8199</w:t>
             </w:r>
           </w:p>
         </w:tc>
@@ -3031,7 +3031,7 @@
           </w:tcPr>
           <w:p>
             <w:r>
-              <w:t>0.8889</w:t>
+              <w:t>0.6667</w:t>
             </w:r>
           </w:p>
         </w:tc>
@@ -3041,7 +3041,7 @@
           </w:tcPr>
           <w:p>
             <w:r>
-              <w:t>0.2407</w:t>
+              <w:t>0.6953</w:t>
             </w:r>
           </w:p>
         </w:tc>
@@ -3197,7 +3197,7 @@
           </w:tcPr>
           <w:p>
             <w:r>
-              <w:t>0.8599</w:t>
+              <w:t>1.0</w:t>
             </w:r>
           </w:p>
         </w:tc>
@@ -3343,7 +3343,7 @@
           </w:tcPr>
           <w:p>
             <w:r>
-              <w:t>1.0</w:t>
+              <w:t>0.8889</w:t>
             </w:r>
           </w:p>
         </w:tc>
@@ -3499,7 +3499,7 @@
           </w:tcPr>
           <w:p>
             <w:r>
-              <w:t>0.4444</w:t>
+              <w:t>0.7778</w:t>
             </w:r>
           </w:p>
         </w:tc>
@@ -3509,7 +3509,7 @@
           </w:tcPr>
           <w:p>
             <w:r>
-              <w:t>0.5187</w:t>
+              <w:t>0.8151</w:t>
             </w:r>
           </w:p>
         </w:tc>
@@ -3655,7 +3655,7 @@
           </w:tcPr>
           <w:p>
             <w:r>
-              <w:t>1.0</w:t>
+              <w:t>0.8889</w:t>
             </w:r>
           </w:p>
         </w:tc>
@@ -3759,7 +3759,7 @@
           </w:tcPr>
           <w:p>
             <w:r>
-              <w:t>0.6667</w:t>
+              <w:t>1.0</w:t>
             </w:r>
           </w:p>
         </w:tc>
@@ -3769,7 +3769,7 @@
           </w:tcPr>
           <w:p>
             <w:r>
-              <w:t>0.6776</w:t>
+              <w:t>1.0</w:t>
             </w:r>
           </w:p>
         </w:tc>
@@ -3915,7 +3915,7 @@
           </w:tcPr>
           <w:p>
             <w:r>
-              <w:t>1.0</w:t>
+              <w:t>0.8889</w:t>
             </w:r>
           </w:p>
         </w:tc>
@@ -4019,7 +4019,7 @@
           </w:tcPr>
           <w:p>
             <w:r>
-              <w:t>0.5556</w:t>
+              <w:t>0.7778</w:t>
             </w:r>
           </w:p>
         </w:tc>
@@ -4029,7 +4029,7 @@
           </w:tcPr>
           <w:p>
             <w:r>
-              <w:t>0.6502</w:t>
+              <w:t>0.8151</w:t>
             </w:r>
           </w:p>
         </w:tc>
@@ -4071,7 +4071,7 @@
           </w:tcPr>
           <w:p>
             <w:r>
-              <w:t>0.8889</w:t>
+              <w:t>1.0</w:t>
             </w:r>
           </w:p>
         </w:tc>
@@ -4123,7 +4123,7 @@
           </w:tcPr>
           <w:p>
             <w:r>
-              <w:t>0.7778</w:t>
+              <w:t>0.8889</w:t>
             </w:r>
           </w:p>
         </w:tc>
@@ -4133,7 +4133,7 @@
           </w:tcPr>
           <w:p>
             <w:r>
-              <w:t>0.8151</w:t>
+              <w:t>1.0</w:t>
             </w:r>
           </w:p>
         </w:tc>
@@ -4185,7 +4185,7 @@
           </w:tcPr>
           <w:p>
             <w:r>
-              <w:t>0.7739</w:t>
+              <w:t>0.6227</w:t>
             </w:r>
           </w:p>
         </w:tc>
@@ -4279,7 +4279,7 @@
           </w:tcPr>
           <w:p>
             <w:r>
-              <w:t>1.0</w:t>
+              <w:t>0.8889</w:t>
             </w:r>
           </w:p>
         </w:tc>
@@ -4289,7 +4289,7 @@
           </w:tcPr>
           <w:p>
             <w:r>
-              <w:t>1.0</w:t>
+              <w:t>0.9203</w:t>
             </w:r>
           </w:p>
         </w:tc>
@@ -4393,7 +4393,7 @@
           </w:tcPr>
           <w:p>
             <w:r>
-              <w:t>1.0</w:t>
+              <w:t>0.6776</w:t>
             </w:r>
           </w:p>
         </w:tc>
@@ -4487,7 +4487,7 @@
           </w:tcPr>
           <w:p>
             <w:r>
-              <w:t>1.0</w:t>
+              <w:t>0.8889</w:t>
             </w:r>
           </w:p>
         </w:tc>

</xml_diff>